<commit_message>
Séance 4 : matière en bloc puis lab, retour en groupe à la séance 5
- Déroulement réorganisé pour le cours à distance : toute la matière,
  puis le Lab 04 en équipe jusqu'à la fin de la soirée
- « À faire à la maison » présenté à la fin de la matière, avant le lab
- Retour en grand groupe déplacé au début de la séance 5; partie 4 du
  Lab 04 (et de la fiche Word) pour le préparer
- Retrait du point « Copier nos réponses » dans les consignes des
  activités des séances 2, 3 et 4

Co-Authored-By: Claude Opus 5.5 <noreply@anthropic.com>
</commit_message>
<xml_diff>
--- a/docs/public/fiches/lab04-fiche-essais.docx
+++ b/docs/public/fiches/lab04-fiche-essais.docx
@@ -1677,6 +1677,135 @@
       </w:tr>
     </w:tbl>
     <w:p/>
+    <w:p>
+      <w:pPr>
+        <w:pStyle w:val="Heading1"/>
+      </w:pPr>
+      <w:r>
+        <w:t>Partie 4 — Le retour en grand groupe (début de la séance 5, 2 minutes)</w:t>
+      </w:r>
+    </w:p>
+    <w:p>
+      <w:r>
+        <w:rPr>
+          <w:i/>
+          <w:color w:val="56616C"/>
+        </w:rPr>
+        <w:t>Une équipe par question sera désignée au début de la séance 5 : toutes les équipes se préparent.</w:t>
+      </w:r>
+    </w:p>
+    <w:tbl>
+      <w:tblPr>
+        <w:tblStyle w:val="TableGrid"/>
+        <w:tblW w:type="auto" w:w="0"/>
+        <w:tblLook w:firstColumn="1" w:firstRow="1" w:lastColumn="0" w:lastRow="0" w:noHBand="0" w:noVBand="1" w:val="04A0"/>
+      </w:tblPr>
+      <w:tblGrid>
+        <w:gridCol w:w="6840"/>
+        <w:gridCol w:w="6840"/>
+      </w:tblGrid>
+      <w:tr>
+        <w:tc>
+          <w:tcPr>
+            <w:tcW w:type="dxa" w:w="5040"/>
+            <w:shd w:val="clear" w:color="auto" w:fill="E0E7FF"/>
+          </w:tcPr>
+          <w:p>
+            <w:r/>
+            <w:r>
+              <w:rPr>
+                <w:b/>
+              </w:rPr>
+              <w:t>Ce qu'on dira</w:t>
+            </w:r>
+          </w:p>
+        </w:tc>
+        <w:tc>
+          <w:tcPr>
+            <w:tcW w:type="dxa" w:w="8640"/>
+            <w:shd w:val="clear" w:color="auto" w:fill="E0E7FF"/>
+          </w:tcPr>
+          <w:p>
+            <w:r/>
+            <w:r>
+              <w:rPr>
+                <w:b/>
+              </w:rPr>
+            </w:r>
+          </w:p>
+        </w:tc>
+      </w:tr>
+      <w:tr>
+        <w:tc>
+          <w:tcPr>
+            <w:tcW w:type="dxa" w:w="5040"/>
+          </w:tcPr>
+          <w:p>
+            <w:r>
+              <w:rPr>
+                <w:b/>
+              </w:rPr>
+              <w:t>Les outils essayés, avec leur famille</w:t>
+            </w:r>
+          </w:p>
+        </w:tc>
+        <w:tc>
+          <w:tcPr>
+            <w:tcW w:type="dxa" w:w="8640"/>
+          </w:tcPr>
+          <w:p>
+            <w:r/>
+          </w:p>
+        </w:tc>
+      </w:tr>
+      <w:tr>
+        <w:tc>
+          <w:tcPr>
+            <w:tcW w:type="dxa" w:w="5040"/>
+          </w:tcPr>
+          <w:p>
+            <w:r>
+              <w:rPr>
+                <w:b/>
+              </w:rPr>
+              <w:t>Deux de nos constats, dont au moins une limite</w:t>
+            </w:r>
+          </w:p>
+        </w:tc>
+        <w:tc>
+          <w:tcPr>
+            <w:tcW w:type="dxa" w:w="8640"/>
+          </w:tcPr>
+          <w:p>
+            <w:r/>
+          </w:p>
+        </w:tc>
+      </w:tr>
+      <w:tr>
+        <w:tc>
+          <w:tcPr>
+            <w:tcW w:type="dxa" w:w="5040"/>
+          </w:tcPr>
+          <w:p>
+            <w:r>
+              <w:rPr>
+                <w:b/>
+              </w:rPr>
+              <w:t>Ce qui est resté non vérifiable</w:t>
+            </w:r>
+          </w:p>
+        </w:tc>
+        <w:tc>
+          <w:tcPr>
+            <w:tcW w:type="dxa" w:w="8640"/>
+          </w:tcPr>
+          <w:p>
+            <w:r/>
+          </w:p>
+        </w:tc>
+      </w:tr>
+    </w:tbl>
+    <w:p/>
     <w:sectPr>
       <w:pgSz w:w="15840" w:h="12240" w:orient="landscape"/>
       <w:pgMar w:top="1080" w:right="1080" w:bottom="1080" w:left="1080" w:header="720" w:footer="720" w:gutter="0"/>

</xml_diff>

<commit_message>
Séance 4 : retirer le verrouillage et les signes de pérennité
- Section « À faire à la maison » réduite au coût sur trois ans et à
  l'activité 2
- Tableau des critères, Lab 04 et fiche Word sans les lignes « facilité
  d'en changer » et « signes de pérennité »
- Activité 1 : la phrase sur un outil qui risque de disparaître est
  remplacée par « Réservio est l'outil le plus rapide »

Co-Authored-By: Claude Opus 5.5 <noreply@anthropic.com>
</commit_message>
<xml_diff>
--- a/docs/public/fiches/lab04-fiche-essais.docx
+++ b/docs/public/fiches/lab04-fiche-essais.docx
@@ -1136,7 +1136,7 @@
           <w:i/>
           <w:color w:val="56616C"/>
         </w:rPr>
-        <w:t>Chaque case contient un fait : une mesure, un prix, un format, une date. Aucun jugement, aucune note, aucun gagnant. Les lignes marquées (maison) se complètent après le cours.</w:t>
+        <w:t>Chaque case contient un fait : une mesure, un prix, un format, une date. Aucun jugement, aucune note, aucun gagnant. La ligne marquée (maison) se complète après le cours.</w:t>
       </w:r>
     </w:p>
     <w:tbl>
@@ -1340,84 +1340,6 @@
                 <w:b/>
               </w:rPr>
               <w:t>Temps pour apprendre (mesuré)</w:t>
-            </w:r>
-          </w:p>
-        </w:tc>
-        <w:tc>
-          <w:tcPr>
-            <w:tcW w:type="dxa" w:w="3384"/>
-          </w:tcPr>
-          <w:p>
-            <w:r/>
-          </w:p>
-        </w:tc>
-        <w:tc>
-          <w:tcPr>
-            <w:tcW w:type="dxa" w:w="3384"/>
-          </w:tcPr>
-          <w:p>
-            <w:r/>
-          </w:p>
-        </w:tc>
-        <w:tc>
-          <w:tcPr>
-            <w:tcW w:type="dxa" w:w="3312"/>
-          </w:tcPr>
-          <w:p>
-            <w:r/>
-          </w:p>
-        </w:tc>
-      </w:tr>
-      <w:tr>
-        <w:tc>
-          <w:tcPr>
-            <w:tcW w:type="dxa" w:w="3600"/>
-          </w:tcPr>
-          <w:p>
-            <w:r>
-              <w:rPr>
-                <w:b/>
-              </w:rPr>
-              <w:t>Facilité d'en changer (export, format, engagement) (maison)</w:t>
-            </w:r>
-          </w:p>
-        </w:tc>
-        <w:tc>
-          <w:tcPr>
-            <w:tcW w:type="dxa" w:w="3384"/>
-          </w:tcPr>
-          <w:p>
-            <w:r/>
-          </w:p>
-        </w:tc>
-        <w:tc>
-          <w:tcPr>
-            <w:tcW w:type="dxa" w:w="3384"/>
-          </w:tcPr>
-          <w:p>
-            <w:r/>
-          </w:p>
-        </w:tc>
-        <w:tc>
-          <w:tcPr>
-            <w:tcW w:type="dxa" w:w="3312"/>
-          </w:tcPr>
-          <w:p>
-            <w:r/>
-          </w:p>
-        </w:tc>
-      </w:tr>
-      <w:tr>
-        <w:tc>
-          <w:tcPr>
-            <w:tcW w:type="dxa" w:w="3600"/>
-          </w:tcPr>
-          <w:p>
-            <w:r>
-              <w:rPr>
-                <w:b/>
-              </w:rPr>
-              <w:t>Signes de pérennité (avec la source) (maison)</w:t>
             </w:r>
           </w:p>
         </w:tc>

</xml_diff>